<commit_message>
Update project documentation and diagrams
Co-Authored-By: Claude Sonnet 5.5 <noreply@anthropic.com>
</commit_message>
<xml_diff>
--- a/docs/Fact_Finding_Instruments.docx
+++ b/docs/Fact_Finding_Instruments.docx
@@ -1787,7 +1787,7 @@
         <w:spacing w:after="120" w:line="300"/>
       </w:pPr>
       <w:r>
-        <w:t xml:space="preserve">The project plans an app and website where verified residents can report crime with photos and location, press an SOS button in an emergency, and get updates on their report.</w:t>
+        <w:t xml:space="preserve">The project plans a website where verified residents can report crime with a map location and evidence, press an SOS button in an emergency, and follow their report.</w:t>
       </w:r>
     </w:p>
     <w:p>
@@ -1845,7 +1845,7 @@
         <w:ind w:left="360"/>
       </w:pPr>
       <w:r>
-        <w:t xml:space="preserve">☐ Report a crime with photos or video     ☐ SOS button with my location     ☐ Alerts about crime near me     ☐ Map of incidents     ☐ Updates on my report     ☐ Works without internet and sends later</w:t>
+        <w:t xml:space="preserve">☐ Report a crime with photos or video     ☐ SOS button with my location     ☐ Alerts about crime near me     ☐ Map of incidents     ☐ Updates on my report</w:t>
       </w:r>
     </w:p>
     <w:p>
@@ -1968,7 +1968,7 @@
         <w:ind w:left="360"/>
       </w:pPr>
       <w:r>
-        <w:t xml:space="preserve">☐ App notification     ☐ SMS     ☐ WhatsApp     ☐ Phone call</w:t>
+        <w:t xml:space="preserve">☐ Website notification     ☐ SMS     ☐ WhatsApp     ☐ Phone call</w:t>
       </w:r>
     </w:p>
     <w:p>
@@ -2531,7 +2531,7 @@
           <w:b/>
           <w:bCs/>
         </w:rPr>
-        <w:t xml:space="preserve">Can you use apps such as WhatsApp and maps on your phone?</w:t>
+        <w:t xml:space="preserve">Can you use websites and WhatsApp on a phone or computer?</w:t>
       </w:r>
     </w:p>
     <w:p>
@@ -2635,7 +2635,7 @@
         <w:ind w:left="360"/>
       </w:pPr>
       <w:r>
-        <w:t xml:space="preserve">☐ Receive reports     ☐ Check and verify reports     ☐ Send reports to the police     ☐ Send alerts to residents     ☐ Show crime statistics     ☐ Track reports until closed</w:t>
+        <w:t xml:space="preserve">☐ Receive reports     ☐ Check and verify reports     ☐ Send reports to the police     ☐ Send alerts to residents     ☐ Track reports until closed</w:t>
       </w:r>
     </w:p>
     <w:p>
@@ -5238,7 +5238,7 @@
           <w:b/>
           <w:bCs/>
         </w:rPr>
-        <w:t xml:space="preserve">How comfortable are you with using a phone app? What training would you need?</w:t>
+        <w:t xml:space="preserve">How comfortable are you with using a website on a phone or computer? What training would you need?</w:t>
       </w:r>
     </w:p>
     <w:p>
@@ -5280,7 +5280,7 @@
           <w:b/>
           <w:bCs/>
         </w:rPr>
-        <w:t xml:space="preserve">How do you think residents will feel about reporting through an app?</w:t>
+        <w:t xml:space="preserve">How do you think residents will feel about reporting through a website?</w:t>
       </w:r>
     </w:p>
     <w:p>
@@ -5969,7 +5969,7 @@
           <w:b/>
           <w:bCs/>
         </w:rPr>
-        <w:t xml:space="preserve">If you had an SOS button on your phone, would you have used it? Why or why not?</w:t>
+        <w:t xml:space="preserve">If you had an SOS button on a website, would you have used it? Why or why not?</w:t>
       </w:r>
     </w:p>
     <w:p>
@@ -6011,7 +6011,7 @@
           <w:b/>
           <w:bCs/>
         </w:rPr>
-        <w:t xml:space="preserve">What worries would you have about sharing your location and details in an app?</w:t>
+        <w:t xml:space="preserve">What worries would you have about sharing your location and details on a website?</w:t>
       </w:r>
     </w:p>
     <w:p>

</xml_diff>